<commit_message>
fix(nas): include all self-use sessions in backup
</commit_message>
<xml_diff>
--- a/docs/OpenFlipbook_NAS_使用說明書_zh-TW.docx
+++ b/docs/OpenFlipbook_NAS_使用說明書_zh-TW.docx
@@ -20,7 +20,7 @@
         <w:rPr>
           <w:rFonts w:ascii="Aptos" w:hAnsi="Aptos" w:eastAsia="Microsoft JhengHei"/>
         </w:rPr>
-        <w:t xml:space="preserve">Release：`nas-self-use-v1.0.1`  </w:t>
+        <w:t xml:space="preserve">Release：`nas-self-use-v1.0.2`  </w:t>
       </w:r>
     </w:p>
     <w:p>
@@ -1187,7 +1187,7 @@
         <w:rPr>
           <w:rFonts w:ascii="Aptos" w:hAnsi="Aptos" w:eastAsia="Microsoft JhengHei"/>
         </w:rPr>
-        <w:t xml:space="preserve">正式自用 release：`nas-self-use-v1.0.1`  </w:t>
+        <w:t xml:space="preserve">正式自用 release：`nas-self-use-v1.0.2`  </w:t>
       </w:r>
     </w:p>
     <w:p>

</xml_diff>